<commit_message>
Complete Maze.odt corrections; fix spelling, grammar and punctuation errors; rename Chapter 2 file
Co-Authored-By: Claude Sonnet 4.6 <noreply@anthropic.com>
</commit_message>
<xml_diff>
--- a/Chapter 8 - Books.docx
+++ b/Chapter 8 - Books.docx
@@ -7,7 +7,7 @@
         <w:pStyle w:val="FirstParagraph"/>
       </w:pPr>
       <w:r>
-        <w:t xml:space="preserve">“And that was the Bee Gees with ‘Tragedy’ its greatest hits of the seventies and eighties all morning long, here at Those Were The Days FM.”</w:t>
+        <w:t>“And that was the Bee Gees with ‘Tragedy’, it’s the greatest hits of the seventies and eighties all morning long, here at Those Were The Days FM.”</w:t>
       </w:r>
     </w:p>
     <w:p>
@@ -64,21 +64,21 @@
         <w:pStyle w:val="BodyText"/>
       </w:pPr>
       <w:r>
-        <w:t xml:space="preserve">Mrs Ting was peering over the balcony. Klee looked at the portable stereo – he remembered when these were all the rage and figured out how to turn it down.</w:t>
-      </w:r>
-    </w:p>
-    <w:p>
-      <w:pPr>
-        <w:pStyle w:val="BodyText"/>
-      </w:pPr>
-      <w:r>
-        <w:t xml:space="preserve">“It’s me Mrs Ting.”</w:t>
+        <w:t>Mrs Ting was peering over the balcony. Klee looked at the portable stereo – he remembered when these were all the rage, and figured out how to turn it down.</w:t>
+      </w:r>
+    </w:p>
+    <w:p>
+      <w:pPr>
+        <w:pStyle w:val="BodyText"/>
+      </w:pPr>
+      <w:r>
+        <w:t>“It’s me, Mrs Ting.”</w:t>
       </w:r>
       <w:r>
         <w:br/>
       </w:r>
       <w:r>
-        <w:t xml:space="preserve">“Oh Mr Klee! I wondered when you’d be back.” She was in a tabard. And her hair was in a scarf. Somehow she looked much younger. Or maybe now she looked her age. Which Klee realised, uncomfortably, was about his age. And she was much friendlier.</w:t>
+        <w:t>“Oh, Mr Klee! I wondered when you’d be back.” She was in a tabard. And her hair was in a scarf. Somehow she looked much younger. Or maybe now she looked her age. Which Klee realised, uncomfortably, was about his age. And she was much friendlier.</w:t>
       </w:r>
     </w:p>
     <w:p>
@@ -94,7 +94,7 @@
         <w:pStyle w:val="BodyText"/>
       </w:pPr>
       <w:r>
-        <w:t xml:space="preserve">Klee found looking up at her a tad awkward. Like just about every conversation between two English people who didn’t know each other well, and, actually, like many conversations between English people who did know each other well. And of course, through his entire career, as soon as anyone knew you were a policeman, in their head, he realised, even the most innocent, law abiding citizens, they did this thing. They thought of the thing that they didn’t want a policeman to know.</w:t>
+        <w:t>Klee found looking up at her a tad awkward. Like just about every conversation between two English people who didn’t know each other well, and, actually, like many conversations between English people who did know each other well. And of course, through his entire career, as soon as anyone knew you were a policeman, in their heads, he realised, even the most innocent, law-abiding citizens, they did this thing. They thought of the thing that they didn’t want a policeman to know.</w:t>
       </w:r>
     </w:p>
     <w:p>
@@ -110,15 +110,15 @@
         <w:pStyle w:val="BodyText"/>
       </w:pPr>
       <w:r>
-        <w:t xml:space="preserve">Maybe Mrs Ting didn’t know yet that he was a policeman. Because when he, slightly breathlessly, made it to where she was standing in the middle of the balcony. She was all smiles. If she had killed anyone, she clearly didn’t think Ernesto Klee had any chance of finding them.</w:t>
-      </w:r>
-    </w:p>
-    <w:p>
-      <w:pPr>
-        <w:pStyle w:val="BodyText"/>
-      </w:pPr>
-      <w:r>
-        <w:t xml:space="preserve">“I’m glad you’re here,” she said, smiling again. I wanted to ask, Mr Boht, he had me do his laundry. Do you want me to do your laundry?</w:t>
+        <w:t>Maybe Mrs Ting didn’t know yet that he was a policeman. Because when he, slightly breathlessly, made it to where she was standing in the middle of the balcony, she was all smiles. If she had killed anyone, she clearly didn’t think Ernesto Klee had any chance of finding them.</w:t>
+      </w:r>
+    </w:p>
+    <w:p>
+      <w:pPr>
+        <w:pStyle w:val="BodyText"/>
+      </w:pPr>
+      <w:r>
+        <w:t>“I’m glad you’re here,” she said, smiling again. “I wanted to ask, Mr Boht had me do his laundry. Do you want me to do your laundry?</w:t>
       </w:r>
     </w:p>
     <w:p>
@@ -192,7 +192,7 @@
         <w:pStyle w:val="BodyText"/>
       </w:pPr>
       <w:r>
-        <w:t xml:space="preserve">In their first meeting, it had crossed Klee’s mind that Mrs Ting had some kind of cognitive deficit. Now it crossed the mind of both Mrs Ting and Ernest Klee that maybe it was Ernesto Klee who had the cognitive deficit. Klee had another go – but he sensed he wasn’t on firm ground.</w:t>
+        <w:t>In their first meeting, it had crossed Klee’s mind that Mrs Ting had some kind of cognitive deficit. Now it crossed the mind of both Mrs Ting and Ernesto Klee that maybe it was Ernesto Klee who had the cognitive deficit. Klee had another go – but he sensed he wasn’t on firm ground.</w:t>
       </w:r>
     </w:p>
     <w:p>
@@ -214,7 +214,7 @@
         <w:br/>
       </w:r>
       <w:r>
-        <w:t xml:space="preserve">“Yes,” said Mrs Ting, a little shortly. He could see that the temper he’d seen when he’d knocked to get the keys was never far from the surface. “But they’re only the picture book and the books that won’t fit on the shelves. Most of the books are in the back room.”</w:t>
+        <w:t>“Yes,” said Mrs Ting, a little shortly. He could see that the temper he’d seen when he’d knocked to get the keys was never far from the surface. “But they’re only the picture books and the books that won’t fit on the shelves. Most of the books are in the back room.”</w:t>
       </w:r>
       <w:r>
         <w:br/>
@@ -233,7 +233,7 @@
         <w:pStyle w:val="BodyText"/>
       </w:pPr>
       <w:r>
-        <w:t xml:space="preserve">He’d missed an entire room! And, in the nature of this building. It wasn’t just a normal sized room. It was the Sunday school room at the back of the building. And it was the same size as the chapel but without any of the fixture and fittings. No pulpit, no organ. No balcony. Just a rectangular box. A rectangular box, about the size of a tennis court. Filled with books.</w:t>
+        <w:t>He’d missed an entire room! And, in the nature of this building. It wasn’t just a normal sized room. It was the Sunday school room at the back of the building. And it was the same size as the chapel but without any of the fixtures and fittings. No pulpit, no organ. No balcony. Just a rectangular box. A rectangular box, about the size of a tennis court. Filled with books.</w:t>
       </w:r>
       <w:r>
         <w:t xml:space="preserve"> </w:t>
@@ -244,7 +244,7 @@
         <w:pStyle w:val="BodyText"/>
       </w:pPr>
       <w:r>
-        <w:t xml:space="preserve">And Klee, at one point, rumoured to be the best detective in the Met. Had missed it. But Klee excused himself a little bit when he saw that it essentially, from the chapel, anyway, it had a secret entrance. The door was part of a dark wall, panelled in dark wood which had been stained and varnished a dozen times. And it was made to look like the rest of the wall. The only clue that there might be something behind it was a lightened patch on what turned out to be the door. The place where hands had for years worn the stain and the varnish away. Although Klee realised it might have been a clue if he’d taken the time to walk around the outside of the building he would have discovered that he’d been placed in charge of a building that was twice the size that he’d originally thought.</w:t>
+        <w:t>And Klee, at one point, rumoured to be the best detective in the Met, had missed it. But Klee excused himself a little bit when he saw that, essentially, from the chapel anyway, it had a secret entrance. The door was part of a dark wall, panelled in dark wood which had been stained and varnished a dozen times. And it was made to look like the rest of the wall. The only clue that there might be something behind it was a lightened patch on what turned out to be the door. The place where hands had for years worn the stain and the varnish away. Although Klee realised it might have been a clue if he’d taken the time to walk around the outside of the building he would have discovered that he’d been placed in charge of a building that was twice the size he’d originally thought.</w:t>
       </w:r>
     </w:p>
     <w:p>
@@ -258,7 +258,7 @@
         <w:br/>
       </w:r>
       <w:r>
-        <w:t xml:space="preserve">“Sorry love, I thought you knew about the books. The washing machine is on the other side. First time you probably need to follow me. It’s a bit of a…”</w:t>
+        <w:t>“Sorry, love, I thought you knew about the books. The washing machine is on the other side. First time you probably need to follow me. It’s a bit of a…”</w:t>
       </w:r>
       <w:r>
         <w:br/>
@@ -272,15 +272,15 @@
         <w:pStyle w:val="BodyText"/>
       </w:pPr>
       <w:r>
-        <w:t xml:space="preserve">“Yes! that’s exactly right! That’s what it is! A maze.”</w:t>
-      </w:r>
-    </w:p>
-    <w:p>
-      <w:pPr>
-        <w:pStyle w:val="BodyText"/>
-      </w:pPr>
-      <w:r>
-        <w:t xml:space="preserve">As he followed Mrs Ting, who set off at the pace of someone who had walked through a maze of bookshelves many times and no longer thought it that strange. He looked at the titles of the books.</w:t>
+        <w:t>“Yes! That’s exactly right! That’s what it is! A maze.”</w:t>
+      </w:r>
+    </w:p>
+    <w:p>
+      <w:pPr>
+        <w:pStyle w:val="BodyText"/>
+      </w:pPr>
+      <w:r>
+        <w:t>As he followed Mrs Ting, who set off at the pace of someone who had walked through a maze of bookshelves many times and no longer thought it that strange, he looked at the titles of the books.</w:t>
       </w:r>
     </w:p>
     <w:p>
@@ -296,7 +296,7 @@
         <w:pStyle w:val="BodyText"/>
       </w:pPr>
       <w:r>
-        <w:t xml:space="preserve">Mass market paper backs. Hard back novels. Antiquarian. He wondered if there was any system to their order on the shelves.</w:t>
+        <w:t>Mass market paperbacks. Hard back novels. Antiquarian. He wondered if there was any system to their order on the shelves.</w:t>
       </w:r>
     </w:p>
     <w:sectPr/>

</xml_diff>

<commit_message>
Klee finds the body when he's celebrating and trying to find somewhere to put the champagne.
</commit_message>
<xml_diff>
--- a/Chapter 8 - Books.docx
+++ b/Chapter 8 - Books.docx
@@ -32,7 +32,13 @@
         <w:pStyle w:val="BodyText"/>
       </w:pPr>
       <w:r>
-        <w:t xml:space="preserve">He didn’t know quite what to do with himself. It seemed too peculiar to go and sit in his tent. I mean just that phrase was pretty odd. </w:t>
+        <w:t xml:space="preserve">He didn’t know quite what to do with himself. It seemed too peculiar to go and sit in his tent. </w:t>
+      </w:r>
+      <w:r>
+        <w:t>J</w:t>
+      </w:r>
+      <w:r>
+        <w:t xml:space="preserve">ust that phrase was pretty odd. </w:t>
       </w:r>
     </w:p>
     <w:p>
@@ -84,7 +90,17 @@
         <w:pStyle w:val="BodyText"/>
       </w:pPr>
       <w:r>
-        <w:t>Klee found looking up at her a tad awkward. Like just about every conversation between two English people who didn’t know each other well, and, actually, like many conversations between English people who did know each other well. And of course, through his entire career, as soon as anyone knew you were a policeman, in their heads, he realised, even the most innocent, law-abiding citizens, they did this thing. They thought of the thing that they didn’t want a policeman to know.</w:t>
+        <w:t xml:space="preserve">Klee found looking up at her a tad awkward. Like just about every conversation between two English people who didn’t know each other well, and, actually, like many conversations between English people who </w:t>
+      </w:r>
+      <w:r>
+        <w:rPr>
+          <w:i/>
+          <w:iCs/>
+        </w:rPr>
+        <w:t>did</w:t>
+      </w:r>
+      <w:r>
+        <w:t xml:space="preserve"> know each other well. And of course, through his entire career, as soon as anyone knew you were a policeman, in their heads, he realised, even the most innocent, law-abiding citizens, they did this thing. They thought of the thing that they didn’t want a policeman to know.</w:t>
       </w:r>
     </w:p>
     <w:p>
@@ -117,7 +133,13 @@
         <w:pStyle w:val="BodyText"/>
       </w:pPr>
       <w:r>
-        <w:t>Laundry. Klee didn’t want to admit that he only had the clothes he stood up in. “I don’t have anything for you just now.”</w:t>
+        <w:t>Laundry. Klee didn’t want to admit that he only had the clothes he stood up in.</w:t>
+      </w:r>
+      <w:r>
+        <w:t xml:space="preserve"> Not to self. Order t-shirts and pants online.</w:t>
+      </w:r>
+      <w:r>
+        <w:t xml:space="preserve"> “I don’t have anything for you just now.”</w:t>
       </w:r>
     </w:p>
     <w:p>
@@ -149,15 +171,22 @@
       </w:r>
       <w:r>
         <w:br/>
-        <w:t>“Ha kitchen! You mean where he has his hotplate?”</w:t>
-      </w:r>
-    </w:p>
-    <w:p>
-      <w:pPr>
-        <w:pStyle w:val="BodyText"/>
-      </w:pPr>
-      <w:r>
-        <w:t>“No, it’s in the back?”</w:t>
+        <w:t xml:space="preserve">“Ha kitchen! </w:t>
+      </w:r>
+      <w:r>
+        <w:t xml:space="preserve">Oh, that horrible pokey little place </w:t>
+      </w:r>
+      <w:r>
+        <w:t>where he has his hotplate?</w:t>
+      </w:r>
+      <w:r>
+        <w:t xml:space="preserve"> </w:t>
+      </w:r>
+      <w:r>
+        <w:t>No, it’s in the back</w:t>
+      </w:r>
+      <w:r>
+        <w:t>. In the big back room.”</w:t>
       </w:r>
       <w:r>
         <w:br/>
@@ -205,9 +234,6 @@
         <w:br/>
         <w:t>“Yes,” said Mrs Ting, a little shortly. He could see that the temper he’d seen when he’d knocked to get the keys was never far from the surface. “But they’re only the picture books and the books that won’t fit on the shelves. Most of the books are in the back room.”</w:t>
       </w:r>
-      <w:r>
-        <w:br/>
-      </w:r>
     </w:p>
     <w:p>
       <w:pPr>
@@ -225,7 +251,13 @@
         <w:pStyle w:val="BodyText"/>
       </w:pPr>
       <w:r>
-        <w:t xml:space="preserve">He’d missed an entire room! And, in the nature of this building. It wasn’t just a normal sized room. It was the Sunday school room at the back of the building. And it was the same size as the chapel but without any of the fixtures and fittings. No pulpit, no organ. No balcony. Just a rectangular box. A rectangular box, about the size of a tennis court. Filled with books. </w:t>
+        <w:t>He’d missed an entire room! And, in the nature of this building. It wasn’t just a normal sized room. It was the Sunday school room at the back of the building. And it was the same size as the chapel but without any of the fixtures and fittings.</w:t>
+      </w:r>
+      <w:r>
+        <w:t xml:space="preserve"> Was it bigger? It might have been bigger.</w:t>
+      </w:r>
+      <w:r>
+        <w:t xml:space="preserve"> No pulpit, no organ. No balcony. Just a rectangular box. A rectangular box, about the size of a tennis court. Filled with books. </w:t>
       </w:r>
     </w:p>
     <w:p>
@@ -234,6 +266,9 @@
       </w:pPr>
       <w:r>
         <w:t>And Klee, at one point, rumoured to be the best detective in the Met, had missed it. But Klee excused himself a little bit when he saw that, essentially, from the chapel anyway, it had a secret entrance. The door was part of a dark wall, panelled in dark wood which had been stained and varnished a dozen times. And it was made to look like the rest of the wall. The only clue that there might be something behind it was a lightened patch on what turned out to be the door. The place where hands had for years worn the stain and the varnish away. Although Klee realised it might have been a clue if he’d taken the time to walk around the outside of the building he would have discovered that he’d been placed in charge of a building that was twice the size he’d originally thought.</w:t>
+      </w:r>
+      <w:r>
+        <w:t xml:space="preserve"> He’d tried to make that a rule when he was responsible for the airship hangar.</w:t>
       </w:r>
     </w:p>
     <w:p>
@@ -274,7 +309,7 @@
         <w:pStyle w:val="BodyText"/>
       </w:pPr>
       <w:r>
-        <w:t>There appeared to be everything!</w:t>
+        <w:t xml:space="preserve">It was definitely an eclectic selection. </w:t>
       </w:r>
     </w:p>
     <w:p>
@@ -283,6 +318,14 @@
       </w:pPr>
       <w:r>
         <w:t>Mass market paperbacks. Hard back novels. Antiquarian. He wondered if there was any system to their order on the shelves.</w:t>
+      </w:r>
+    </w:p>
+    <w:p>
+      <w:pPr>
+        <w:pStyle w:val="BodyText"/>
+      </w:pPr>
+      <w:r>
+        <w:t>But it also looked like there might be sections were there were just lots and lots of copies of the same books – remaindered books?</w:t>
       </w:r>
     </w:p>
     <w:sectPr>

</xml_diff>